<commit_message>
feat(documents): împuternicire stare civilă v2 (ajustări Raul)
Co-Authored-By: Claude Opus 4.8 (1M context) <noreply@anthropic.com>
</commit_message>
<xml_diff>
--- a/src/templates/certificat-casatorie/imputernicire.docx
+++ b/src/templates/certificat-casatorie/imputernicire.docx
@@ -864,29 +864,30 @@
       </w:pPr>
       <w:r>
         <w:rPr>
-          <w:rFonts w:ascii="Arial" w:cs="Arial" w:eastAsia="Arial" w:hAnsi="Arial"/>
-          <w:color w:val="000080"/>
-        </w:rPr>
+          <w:rtl w:val="0"/>
+        </w:rPr>
+      </w:r>
+      <w:r>
         <mc:AlternateContent>
           <mc:Choice Requires="wpg">
             <w:drawing>
               <wp:anchor allowOverlap="1" behindDoc="0" distB="0" distT="0" distL="114300" distR="114300" hidden="0" layoutInCell="1" locked="0" relativeHeight="0" simplePos="0">
                 <wp:simplePos x="0" y="0"/>
-                <wp:positionH relativeFrom="page">
-                  <wp:posOffset>4383405</wp:posOffset>
+                <wp:positionH relativeFrom="column">
+                  <wp:posOffset>3743325</wp:posOffset>
                 </wp:positionH>
-                <wp:positionV relativeFrom="page">
-                  <wp:posOffset>4052921</wp:posOffset>
+                <wp:positionV relativeFrom="paragraph">
+                  <wp:posOffset>50825</wp:posOffset>
                 </wp:positionV>
                 <wp:extent cx="2752725" cy="2344562"/>
                 <wp:effectExtent b="0" l="0" r="0" t="0"/>
                 <wp:wrapNone/>
-                <wp:docPr id="2" name=""/>
+                <wp:docPr id="1" name=""/>
                 <a:graphic>
                   <a:graphicData uri="http://schemas.microsoft.com/office/word/2010/wordprocessingShape">
                     <wps:wsp>
                       <wps:cNvSpPr/>
-                      <wps:cNvPr id="3" name="Shape 3"/>
+                      <wps:cNvPr id="2" name="Shape 2"/>
                       <wps:spPr>
                         <a:xfrm>
                           <a:off x="3974400" y="3107230"/>
@@ -1232,21 +1233,21 @@
             <w:drawing>
               <wp:anchor allowOverlap="1" behindDoc="0" distB="0" distT="0" distL="114300" distR="114300" hidden="0" layoutInCell="1" locked="0" relativeHeight="0" simplePos="0">
                 <wp:simplePos x="0" y="0"/>
-                <wp:positionH relativeFrom="page">
-                  <wp:posOffset>4383405</wp:posOffset>
+                <wp:positionH relativeFrom="column">
+                  <wp:posOffset>3743325</wp:posOffset>
                 </wp:positionH>
-                <wp:positionV relativeFrom="page">
-                  <wp:posOffset>4052921</wp:posOffset>
+                <wp:positionV relativeFrom="paragraph">
+                  <wp:posOffset>50825</wp:posOffset>
                 </wp:positionV>
                 <wp:extent cx="2752725" cy="2344562"/>
                 <wp:effectExtent b="0" l="0" r="0" t="0"/>
                 <wp:wrapNone/>
-                <wp:docPr id="2" name="image3.png"/>
+                <wp:docPr id="1" name="image2.png"/>
                 <a:graphic>
                   <a:graphicData uri="http://schemas.openxmlformats.org/drawingml/2006/picture">
                     <pic:pic>
                       <pic:nvPicPr>
-                        <pic:cNvPr id="0" name="image3.png"/>
+                        <pic:cNvPr id="0" name="image2.png"/>
                         <pic:cNvPicPr preferRelativeResize="0"/>
                       </pic:nvPicPr>
                       <pic:blipFill>
@@ -1272,11 +1273,6 @@
           </mc:Fallback>
         </mc:AlternateContent>
       </w:r>
-      <w:r>
-        <w:rPr>
-          <w:rtl w:val="0"/>
-        </w:rPr>
-      </w:r>
     </w:p>
     <w:p>
       <w:pPr>
@@ -1437,19 +1433,19 @@
                 <wp:positionV relativeFrom="paragraph">
                   <wp:posOffset>85725</wp:posOffset>
                 </wp:positionV>
-                <wp:extent cx="1564957" cy="548751"/>
+                <wp:extent cx="1450657" cy="541579"/>
                 <wp:effectExtent b="0" l="0" r="0" t="0"/>
                 <wp:wrapNone/>
-                <wp:docPr id="1" name=""/>
+                <wp:docPr id="2" name=""/>
                 <a:graphic>
                   <a:graphicData uri="http://schemas.microsoft.com/office/word/2010/wordprocessingShape">
                     <wps:wsp>
                       <wps:cNvSpPr/>
-                      <wps:cNvPr id="2" name="Shape 2"/>
+                      <wps:cNvPr id="3" name="Shape 3"/>
                       <wps:spPr>
                         <a:xfrm>
                           <a:off x="4136375" y="3521250"/>
-                          <a:ext cx="2495400" cy="640500"/>
+                          <a:ext cx="2123100" cy="640500"/>
                         </a:xfrm>
                         <a:prstGeom prst="rect">
                           <a:avLst/>
@@ -1478,7 +1474,7 @@
                                 <w:smallCaps w:val="0"/>
                                 <w:strike w:val="0"/>
                                 <w:color w:val="000080"/>
-                                <w:sz w:val="28"/>
+                                <w:sz w:val="24"/>
                                 <w:vertAlign w:val="baseline"/>
                               </w:rPr>
                               <w:t xml:space="preserve">CLIENT/REPREZENTANT, *</w:t>
@@ -1499,7 +1495,7 @@
                                 <w:smallCaps w:val="0"/>
                                 <w:strike w:val="0"/>
                                 <w:color w:val="000080"/>
-                                <w:sz w:val="28"/>
+                                <w:sz w:val="24"/>
                                 <w:vertAlign w:val="baseline"/>
                               </w:rPr>
                             </w:r>
@@ -1511,7 +1507,7 @@
                                 <w:smallCaps w:val="0"/>
                                 <w:strike w:val="0"/>
                                 <w:color w:val="000080"/>
-                                <w:sz w:val="20"/>
+                                <w:sz w:val="16"/>
                                 <w:vertAlign w:val="baseline"/>
                               </w:rPr>
                               <w:t xml:space="preserve">   </w:t>
@@ -1524,7 +1520,7 @@
                                 <w:smallCaps w:val="0"/>
                                 <w:strike w:val="0"/>
                                 <w:color w:val="000080"/>
-                                <w:sz w:val="20"/>
+                                <w:sz w:val="16"/>
                                 <w:vertAlign w:val="baseline"/>
                               </w:rPr>
                               <w:t xml:space="preserve">………………………………</w:t>
@@ -1537,7 +1533,7 @@
                                 <w:smallCaps w:val="0"/>
                                 <w:strike w:val="0"/>
                                 <w:color w:val="000080"/>
-                                <w:sz w:val="20"/>
+                                <w:sz w:val="16"/>
                                 <w:vertAlign w:val="baseline"/>
                               </w:rPr>
                               <w:t xml:space="preserve">………</w:t>
@@ -1550,7 +1546,7 @@
                                 <w:smallCaps w:val="0"/>
                                 <w:strike w:val="0"/>
                                 <w:color w:val="000080"/>
-                                <w:sz w:val="20"/>
+                                <w:sz w:val="16"/>
                                 <w:vertAlign w:val="baseline"/>
                               </w:rPr>
                               <w:t xml:space="preserve">.</w:t>
@@ -1571,7 +1567,7 @@
                                 <w:smallCaps w:val="0"/>
                                 <w:strike w:val="0"/>
                                 <w:color w:val="000080"/>
-                                <w:sz w:val="20"/>
+                                <w:sz w:val="16"/>
                                 <w:vertAlign w:val="baseline"/>
                               </w:rPr>
                             </w:r>
@@ -1583,7 +1579,7 @@
                                 <w:smallCaps w:val="0"/>
                                 <w:strike w:val="0"/>
                                 <w:color w:val="000080"/>
-                                <w:sz w:val="20"/>
+                                <w:sz w:val="16"/>
                                 <w:vertAlign w:val="baseline"/>
                               </w:rPr>
                               <w:t xml:space="preserve">                    (semnătura) </w:t>
@@ -1604,7 +1600,7 @@
                                 <w:smallCaps w:val="0"/>
                                 <w:strike w:val="0"/>
                                 <w:color w:val="000080"/>
-                                <w:sz w:val="20"/>
+                                <w:sz w:val="16"/>
                                 <w:vertAlign w:val="baseline"/>
                               </w:rPr>
                             </w:r>
@@ -1650,15 +1646,15 @@
                 <wp:positionV relativeFrom="paragraph">
                   <wp:posOffset>85725</wp:posOffset>
                 </wp:positionV>
-                <wp:extent cx="1564957" cy="548751"/>
+                <wp:extent cx="1450657" cy="541579"/>
                 <wp:effectExtent b="0" l="0" r="0" t="0"/>
                 <wp:wrapNone/>
-                <wp:docPr id="1" name="image2.png"/>
+                <wp:docPr id="2" name="image3.png"/>
                 <a:graphic>
                   <a:graphicData uri="http://schemas.openxmlformats.org/drawingml/2006/picture">
                     <pic:pic>
                       <pic:nvPicPr>
-                        <pic:cNvPr id="0" name="image2.png"/>
+                        <pic:cNvPr id="0" name="image3.png"/>
                         <pic:cNvPicPr preferRelativeResize="0"/>
                       </pic:nvPicPr>
                       <pic:blipFill>
@@ -1671,7 +1667,7 @@
                       <pic:spPr>
                         <a:xfrm>
                           <a:off x="0" y="0"/>
-                          <a:ext cx="1564957" cy="548751"/>
+                          <a:ext cx="1450657" cy="541579"/>
                         </a:xfrm>
                         <a:prstGeom prst="rect"/>
                         <a:ln/>

</xml_diff>

<commit_message>
feat(documents): împuternicire stare civilă v3 (ajustări Raul)
Co-Authored-By: Claude Opus 4.8 (1M context) <noreply@anthropic.com>
</commit_message>
<xml_diff>
--- a/src/templates/certificat-casatorie/imputernicire.docx
+++ b/src/templates/certificat-casatorie/imputernicire.docx
@@ -423,17 +423,53 @@
           <w:vertAlign w:val="baseline"/>
           <w:rtl w:val="0"/>
         </w:rPr>
-        <w:t xml:space="preserve">{CLIENT_STARE_CIVILA}},{{FILIATIE}}</w:t>
-      </w:r>
-      <w:r>
-        <w:rPr>
-          <w:rFonts w:ascii="Arial" w:cs="Arial" w:eastAsia="Arial" w:hAnsi="Arial"/>
-          <w:color w:val="000080"/>
-          <w:vertAlign w:val="baseline"/>
-          <w:rtl w:val="0"/>
-        </w:rPr>
-        <w:t xml:space="preserve">……………………………………………</w:t>
+        <w:t xml:space="preserve">{CLIENT_STARE_CIVILA}}</w:t>
+      </w:r>
+      <w:r>
+        <w:rPr>
+          <w:rFonts w:ascii="Arial" w:cs="Arial" w:eastAsia="Arial" w:hAnsi="Arial"/>
+          <w:color w:val="000080"/>
+          <w:vertAlign w:val="baseline"/>
+          <w:rtl w:val="0"/>
+        </w:rPr>
+        <w:t xml:space="preserve">………</w:t>
+      </w:r>
+      <w:r>
+        <w:rPr>
+          <w:rFonts w:ascii="Arial" w:cs="Arial" w:eastAsia="Arial" w:hAnsi="Arial"/>
+          <w:color w:val="000080"/>
+          <w:rtl w:val="0"/>
+        </w:rPr>
+        <w:t xml:space="preserve">………………</w:t>
+      </w:r>
+      <w:r>
+        <w:rPr>
+          <w:rFonts w:ascii="Arial" w:cs="Arial" w:eastAsia="Arial" w:hAnsi="Arial"/>
+          <w:color w:val="000080"/>
+          <w:vertAlign w:val="baseline"/>
+          <w:rtl w:val="0"/>
+        </w:rPr>
+        <w:t xml:space="preserve">……………………………………</w:t>
         <w:br w:type="textWrapping"/>
+      </w:r>
+      <w:r>
+        <w:rPr>
+          <w:rFonts w:ascii="Arial" w:cs="Arial" w:eastAsia="Arial" w:hAnsi="Arial"/>
+          <w:b w:val="1"/>
+          <w:bCs w:val="1"/>
+          <w:color w:val="000080"/>
+          <w:u w:val="single"/>
+          <w:rtl w:val="0"/>
+        </w:rPr>
+        <w:t xml:space="preserve">{{NUMETATA}}{{NUMEMAMA}} </w:t>
+      </w:r>
+      <w:r>
+        <w:rPr>
+          <w:rFonts w:ascii="Arial" w:cs="Arial" w:eastAsia="Arial" w:hAnsi="Arial"/>
+          <w:color w:val="000080"/>
+          <w:vertAlign w:val="baseline"/>
+          <w:rtl w:val="0"/>
+        </w:rPr>
         <w:t xml:space="preserve">....................................................................................................................................................…………………………, </w:t>
       </w:r>
     </w:p>
@@ -494,6 +530,17 @@
           <w:rFonts w:ascii="Arial" w:cs="Arial" w:eastAsia="Arial" w:hAnsi="Arial"/>
           <w:b w:val="1"/>
           <w:bCs w:val="1"/>
+          <w:color w:val="000080"/>
+          <w:u w:val="single"/>
+          <w:rtl w:val="0"/>
+        </w:rPr>
+        <w:t xml:space="preserve">{{SERIE}} </w:t>
+      </w:r>
+      <w:r>
+        <w:rPr>
+          <w:rFonts w:ascii="Arial" w:cs="Arial" w:eastAsia="Arial" w:hAnsi="Arial"/>
+          <w:b w:val="1"/>
+          <w:bCs w:val="1"/>
           <w:i w:val="0"/>
           <w:iCs w:val="0"/>
           <w:smallCaps w:val="0"/>
@@ -628,7 +675,7 @@
           <w:vertAlign w:val="baseline"/>
           <w:rtl w:val="0"/>
         </w:rPr>
-        <w:t xml:space="preserve">{{ACTIVITATI_SC}}, </w:t>
+        <w:t xml:space="preserve">{{ACTIVITATI_SC}}, stare status civil:</w:t>
       </w:r>
       <w:r>
         <w:rPr>
@@ -639,7 +686,7 @@
           <w:u w:val="single"/>
           <w:rtl w:val="0"/>
         </w:rPr>
-        <w:t xml:space="preserve">{{FILIATIE}}, {{NUMEMAMA}} {{NUMETATA}}</w:t>
+        <w:t xml:space="preserve">{{FILIATIE}}</w:t>
       </w:r>
       <w:r>
         <w:rPr>

</xml_diff>

<commit_message>
feat(documents): imputernicire stare civila v4 (ajustari Raul)
Co-Authored-By: Claude Opus 4.8 (1M context) <noreply@anthropic.com>
</commit_message>
<xml_diff>
--- a/src/templates/certificat-casatorie/imputernicire.docx
+++ b/src/templates/certificat-casatorie/imputernicire.docx
@@ -69,12 +69,12 @@
             <wp:extent cx="600075" cy="607060"/>
             <wp:effectExtent b="0" l="0" r="0" t="0"/>
             <wp:wrapSquare wrapText="bothSides" distB="0" distT="0" distL="114300" distR="114300"/>
-            <wp:docPr descr="Sigla_UNBR_LUX" id="3" name="image1.jpg"/>
+            <wp:docPr descr="Sigla_UNBR_LUX" id="3" name="image2.jpg"/>
             <a:graphic>
               <a:graphicData uri="http://schemas.openxmlformats.org/drawingml/2006/picture">
                 <pic:pic>
                   <pic:nvPicPr>
-                    <pic:cNvPr descr="Sigla_UNBR_LUX" id="0" name="image1.jpg"/>
+                    <pic:cNvPr descr="Sigla_UNBR_LUX" id="0" name="image2.jpg"/>
                     <pic:cNvPicPr preferRelativeResize="0"/>
                   </pic:nvPicPr>
                   <pic:blipFill>
@@ -366,6 +366,7 @@
     </w:p>
     <w:p>
       <w:pPr>
+        <w:spacing w:line="276" w:lineRule="auto"/>
         <w:rPr>
           <w:rFonts w:ascii="Arial" w:cs="Arial" w:eastAsia="Arial" w:hAnsi="Arial"/>
           <w:color w:val="000080"/>
@@ -432,25 +433,8 @@
           <w:vertAlign w:val="baseline"/>
           <w:rtl w:val="0"/>
         </w:rPr>
-        <w:t xml:space="preserve">………</w:t>
-      </w:r>
-      <w:r>
-        <w:rPr>
-          <w:rFonts w:ascii="Arial" w:cs="Arial" w:eastAsia="Arial" w:hAnsi="Arial"/>
-          <w:color w:val="000080"/>
-          <w:rtl w:val="0"/>
-        </w:rPr>
-        <w:t xml:space="preserve">………………</w:t>
-      </w:r>
-      <w:r>
-        <w:rPr>
-          <w:rFonts w:ascii="Arial" w:cs="Arial" w:eastAsia="Arial" w:hAnsi="Arial"/>
-          <w:color w:val="000080"/>
-          <w:vertAlign w:val="baseline"/>
-          <w:rtl w:val="0"/>
-        </w:rPr>
-        <w:t xml:space="preserve">……………………………………</w:t>
         <w:br w:type="textWrapping"/>
+        <w:t xml:space="preserve">....................</w:t>
       </w:r>
       <w:r>
         <w:rPr>
@@ -470,7 +454,312 @@
           <w:vertAlign w:val="baseline"/>
           <w:rtl w:val="0"/>
         </w:rPr>
-        <w:t xml:space="preserve">....................................................................................................................................................…………………………, </w:t>
+        <w:t xml:space="preserve">............................…………………………, </w:t>
+      </w:r>
+    </w:p>
+    <w:p>
+      <w:pPr>
+        <w:keepNext w:val="0"/>
+        <w:keepLines w:val="0"/>
+        <w:pageBreakBefore w:val="0"/>
+        <w:widowControl w:val="1"/>
+        <w:pBdr>
+          <w:top w:space="0" w:sz="0" w:val="nil"/>
+          <w:left w:space="0" w:sz="0" w:val="nil"/>
+          <w:bottom w:space="0" w:sz="0" w:val="nil"/>
+          <w:right w:space="0" w:sz="0" w:val="nil"/>
+          <w:between w:space="0" w:sz="0" w:val="nil"/>
+        </w:pBdr>
+        <w:shd w:fill="auto" w:val="clear"/>
+        <w:spacing w:after="0" w:before="0" w:line="276" w:lineRule="auto"/>
+        <w:ind w:left="0" w:right="0" w:firstLine="0"/>
+        <w:jc w:val="left"/>
+        <w:rPr>
+          <w:rFonts w:ascii="Arial" w:cs="Arial" w:eastAsia="Arial" w:hAnsi="Arial"/>
+          <w:b w:val="0"/>
+          <w:bCs w:val="0"/>
+          <w:i w:val="0"/>
+          <w:iCs w:val="0"/>
+          <w:smallCaps w:val="0"/>
+          <w:strike w:val="0"/>
+          <w:color w:val="000080"/>
+          <w:sz w:val="20"/>
+          <w:szCs w:val="20"/>
+          <w:u w:val="none"/>
+          <w:shd w:fill="auto" w:val="clear"/>
+          <w:vertAlign w:val="baseline"/>
+        </w:rPr>
+      </w:pPr>
+      <w:r>
+        <w:rPr>
+          <w:rFonts w:ascii="Arial" w:cs="Arial" w:eastAsia="Arial" w:hAnsi="Arial"/>
+          <w:b w:val="0"/>
+          <w:bCs w:val="0"/>
+          <w:i w:val="0"/>
+          <w:iCs w:val="0"/>
+          <w:smallCaps w:val="0"/>
+          <w:strike w:val="0"/>
+          <w:color w:val="000080"/>
+          <w:sz w:val="20"/>
+          <w:szCs w:val="20"/>
+          <w:u w:val="none"/>
+          <w:shd w:fill="auto" w:val="clear"/>
+          <w:vertAlign w:val="baseline"/>
+          <w:rtl w:val="0"/>
+        </w:rPr>
+        <w:t xml:space="preserve">în baza contractului de asistenţă juridică nr. </w:t>
+      </w:r>
+      <w:r>
+        <w:rPr>
+          <w:rFonts w:ascii="Arial" w:cs="Arial" w:eastAsia="Arial" w:hAnsi="Arial"/>
+          <w:b w:val="1"/>
+          <w:bCs w:val="1"/>
+          <w:color w:val="000080"/>
+          <w:u w:val="single"/>
+          <w:rtl w:val="0"/>
+        </w:rPr>
+        <w:t xml:space="preserve">{{SERIE}} </w:t>
+      </w:r>
+      <w:r>
+        <w:rPr>
+          <w:rFonts w:ascii="Arial" w:cs="Arial" w:eastAsia="Arial" w:hAnsi="Arial"/>
+          <w:b w:val="1"/>
+          <w:bCs w:val="1"/>
+          <w:i w:val="0"/>
+          <w:iCs w:val="0"/>
+          <w:smallCaps w:val="0"/>
+          <w:strike w:val="0"/>
+          <w:color w:val="000080"/>
+          <w:sz w:val="20"/>
+          <w:szCs w:val="20"/>
+          <w:u w:val="single"/>
+          <w:shd w:fill="auto" w:val="clear"/>
+          <w:vertAlign w:val="baseline"/>
+          <w:rtl w:val="0"/>
+        </w:rPr>
+        <w:t xml:space="preserve">{{NRCONTRACT}}</w:t>
+      </w:r>
+      <w:r>
+        <w:rPr>
+          <w:rFonts w:ascii="Arial" w:cs="Arial" w:eastAsia="Arial" w:hAnsi="Arial"/>
+          <w:b w:val="0"/>
+          <w:bCs w:val="0"/>
+          <w:i w:val="0"/>
+          <w:iCs w:val="0"/>
+          <w:smallCaps w:val="0"/>
+          <w:strike w:val="0"/>
+          <w:color w:val="000080"/>
+          <w:sz w:val="20"/>
+          <w:szCs w:val="20"/>
+          <w:u w:val="single"/>
+          <w:shd w:fill="auto" w:val="clear"/>
+          <w:vertAlign w:val="baseline"/>
+          <w:rtl w:val="0"/>
+        </w:rPr>
+        <w:t xml:space="preserve"> </w:t>
+      </w:r>
+      <w:r>
+        <w:rPr>
+          <w:rFonts w:ascii="Arial" w:cs="Arial" w:eastAsia="Arial" w:hAnsi="Arial"/>
+          <w:b w:val="0"/>
+          <w:bCs w:val="0"/>
+          <w:i w:val="0"/>
+          <w:iCs w:val="0"/>
+          <w:smallCaps w:val="0"/>
+          <w:strike w:val="0"/>
+          <w:color w:val="000080"/>
+          <w:sz w:val="20"/>
+          <w:szCs w:val="20"/>
+          <w:u w:val="none"/>
+          <w:shd w:fill="auto" w:val="clear"/>
+          <w:vertAlign w:val="baseline"/>
+          <w:rtl w:val="0"/>
+        </w:rPr>
+        <w:t xml:space="preserve">din </w:t>
+      </w:r>
+      <w:r>
+        <w:rPr>
+          <w:rFonts w:ascii="Arial" w:cs="Arial" w:eastAsia="Arial" w:hAnsi="Arial"/>
+          <w:b w:val="1"/>
+          <w:bCs w:val="1"/>
+          <w:color w:val="000080"/>
+          <w:u w:val="single"/>
+          <w:rtl w:val="0"/>
+        </w:rPr>
+        <w:t xml:space="preserve">{{DATA}},</w:t>
+      </w:r>
+      <w:r>
+        <w:rPr>
+          <w:rFonts w:ascii="Arial" w:cs="Arial" w:eastAsia="Arial" w:hAnsi="Arial"/>
+          <w:b w:val="0"/>
+          <w:bCs w:val="0"/>
+          <w:i w:val="0"/>
+          <w:iCs w:val="0"/>
+          <w:smallCaps w:val="0"/>
+          <w:strike w:val="0"/>
+          <w:color w:val="000080"/>
+          <w:sz w:val="20"/>
+          <w:szCs w:val="20"/>
+          <w:u w:val="none"/>
+          <w:shd w:fill="auto" w:val="clear"/>
+          <w:vertAlign w:val="baseline"/>
+          <w:rtl w:val="0"/>
+        </w:rPr>
+        <w:t xml:space="preserve"> să exercite următoarele activităţi: </w:t>
+      </w:r>
+      <w:r>
+        <w:rPr>
+          <w:rFonts w:ascii="Arial" w:cs="Arial" w:eastAsia="Arial" w:hAnsi="Arial"/>
+          <w:b w:val="1"/>
+          <w:bCs w:val="1"/>
+          <w:i w:val="0"/>
+          <w:iCs w:val="0"/>
+          <w:smallCaps w:val="0"/>
+          <w:strike w:val="0"/>
+          <w:color w:val="000080"/>
+          <w:sz w:val="20"/>
+          <w:szCs w:val="20"/>
+          <w:u w:val="single"/>
+          <w:shd w:fill="auto" w:val="clear"/>
+          <w:vertAlign w:val="baseline"/>
+          <w:rtl w:val="0"/>
+        </w:rPr>
+        <w:t xml:space="preserve">{{ACTIVITATI_SC}}, stare status civil:</w:t>
+      </w:r>
+      <w:r>
+        <w:rPr>
+          <w:rFonts w:ascii="Arial" w:cs="Arial" w:eastAsia="Arial" w:hAnsi="Arial"/>
+          <w:b w:val="1"/>
+          <w:bCs w:val="1"/>
+          <w:color w:val="000080"/>
+          <w:u w:val="single"/>
+          <w:rtl w:val="0"/>
+        </w:rPr>
+        <w:t xml:space="preserve">{{FILIATIE}}</w:t>
+      </w:r>
+      <w:r>
+        <w:rPr>
+          <w:rtl w:val="0"/>
+        </w:rPr>
+      </w:r>
+    </w:p>
+    <w:p>
+      <w:pPr>
+        <w:keepNext w:val="0"/>
+        <w:keepLines w:val="0"/>
+        <w:pageBreakBefore w:val="0"/>
+        <w:widowControl w:val="1"/>
+        <w:pBdr>
+          <w:top w:space="0" w:sz="0" w:val="nil"/>
+          <w:left w:space="0" w:sz="0" w:val="nil"/>
+          <w:bottom w:space="0" w:sz="0" w:val="nil"/>
+          <w:right w:space="0" w:sz="0" w:val="nil"/>
+          <w:between w:space="0" w:sz="0" w:val="nil"/>
+        </w:pBdr>
+        <w:shd w:fill="auto" w:val="clear"/>
+        <w:spacing w:after="0" w:before="0" w:line="276" w:lineRule="auto"/>
+        <w:ind w:left="0" w:right="0" w:firstLine="0"/>
+        <w:jc w:val="left"/>
+        <w:rPr>
+          <w:rFonts w:ascii="Arial" w:cs="Arial" w:eastAsia="Arial" w:hAnsi="Arial"/>
+          <w:b w:val="0"/>
+          <w:bCs w:val="0"/>
+          <w:i w:val="0"/>
+          <w:iCs w:val="0"/>
+          <w:smallCaps w:val="0"/>
+          <w:strike w:val="0"/>
+          <w:color w:val="000080"/>
+          <w:sz w:val="20"/>
+          <w:szCs w:val="20"/>
+          <w:u w:val="none"/>
+          <w:shd w:fill="auto" w:val="clear"/>
+          <w:vertAlign w:val="baseline"/>
+        </w:rPr>
+      </w:pPr>
+      <w:r>
+        <w:rPr>
+          <w:rFonts w:ascii="Arial" w:cs="Arial" w:eastAsia="Arial" w:hAnsi="Arial"/>
+          <w:b w:val="0"/>
+          <w:bCs w:val="0"/>
+          <w:i w:val="0"/>
+          <w:iCs w:val="0"/>
+          <w:smallCaps w:val="0"/>
+          <w:strike w:val="0"/>
+          <w:color w:val="000080"/>
+          <w:sz w:val="20"/>
+          <w:szCs w:val="20"/>
+          <w:u w:val="none"/>
+          <w:shd w:fill="auto" w:val="clear"/>
+          <w:vertAlign w:val="baseline"/>
+          <w:rtl w:val="0"/>
+        </w:rPr>
+        <w:t xml:space="preserve">…………………………..……………………………………………………………………………………………………………………………………………………………………………………………………………………………………………..……… </w:t>
+      </w:r>
+    </w:p>
+    <w:p>
+      <w:pPr>
+        <w:keepNext w:val="0"/>
+        <w:keepLines w:val="0"/>
+        <w:pageBreakBefore w:val="0"/>
+        <w:widowControl w:val="1"/>
+        <w:pBdr>
+          <w:top w:space="0" w:sz="0" w:val="nil"/>
+          <w:left w:space="0" w:sz="0" w:val="nil"/>
+          <w:bottom w:space="0" w:sz="0" w:val="nil"/>
+          <w:right w:space="0" w:sz="0" w:val="nil"/>
+          <w:between w:space="0" w:sz="0" w:val="nil"/>
+        </w:pBdr>
+        <w:shd w:fill="auto" w:val="clear"/>
+        <w:spacing w:after="0" w:before="0" w:line="276" w:lineRule="auto"/>
+        <w:ind w:left="0" w:right="0" w:firstLine="0"/>
+        <w:jc w:val="left"/>
+        <w:rPr>
+          <w:rFonts w:ascii="Arial" w:cs="Arial" w:eastAsia="Arial" w:hAnsi="Arial"/>
+          <w:color w:val="000080"/>
+        </w:rPr>
+      </w:pPr>
+      <w:r>
+        <w:rPr>
+          <w:rFonts w:ascii="Arial" w:cs="Arial" w:eastAsia="Arial" w:hAnsi="Arial"/>
+          <w:b w:val="0"/>
+          <w:bCs w:val="0"/>
+          <w:i w:val="0"/>
+          <w:iCs w:val="0"/>
+          <w:smallCaps w:val="0"/>
+          <w:strike w:val="0"/>
+          <w:color w:val="000080"/>
+          <w:sz w:val="20"/>
+          <w:szCs w:val="20"/>
+          <w:u w:val="none"/>
+          <w:shd w:fill="auto" w:val="clear"/>
+          <w:vertAlign w:val="baseline"/>
+          <w:rtl w:val="0"/>
+        </w:rPr>
+        <w:t xml:space="preserve">şi să asiste/ să reprezinte clientul în faţa </w:t>
+      </w:r>
+      <w:r>
+        <w:rPr>
+          <w:rFonts w:ascii="Arial" w:cs="Arial" w:eastAsia="Arial" w:hAnsi="Arial"/>
+          <w:b w:val="1"/>
+          <w:bCs w:val="1"/>
+          <w:i w:val="0"/>
+          <w:iCs w:val="0"/>
+          <w:smallCaps w:val="0"/>
+          <w:strike w:val="0"/>
+          <w:color w:val="000080"/>
+          <w:sz w:val="20"/>
+          <w:szCs w:val="20"/>
+          <w:u w:val="single"/>
+          <w:shd w:fill="auto" w:val="clear"/>
+          <w:vertAlign w:val="baseline"/>
+          <w:rtl w:val="0"/>
+        </w:rPr>
+        <w:t xml:space="preserve">{{AUTORITATE_SC}}</w:t>
+      </w:r>
+      <w:r>
+        <w:rPr>
+          <w:rtl w:val="0"/>
+        </w:rPr>
       </w:r>
     </w:p>
     <w:p>
@@ -523,368 +812,7 @@
           <w:vertAlign w:val="baseline"/>
           <w:rtl w:val="0"/>
         </w:rPr>
-        <w:t xml:space="preserve">în baza contractului de asistenţă juridică nr. </w:t>
-      </w:r>
-      <w:r>
-        <w:rPr>
-          <w:rFonts w:ascii="Arial" w:cs="Arial" w:eastAsia="Arial" w:hAnsi="Arial"/>
-          <w:b w:val="1"/>
-          <w:bCs w:val="1"/>
-          <w:color w:val="000080"/>
-          <w:u w:val="single"/>
-          <w:rtl w:val="0"/>
-        </w:rPr>
-        <w:t xml:space="preserve">{{SERIE}} </w:t>
-      </w:r>
-      <w:r>
-        <w:rPr>
-          <w:rFonts w:ascii="Arial" w:cs="Arial" w:eastAsia="Arial" w:hAnsi="Arial"/>
-          <w:b w:val="1"/>
-          <w:bCs w:val="1"/>
-          <w:i w:val="0"/>
-          <w:iCs w:val="0"/>
-          <w:smallCaps w:val="0"/>
-          <w:strike w:val="0"/>
-          <w:color w:val="000080"/>
-          <w:sz w:val="20"/>
-          <w:szCs w:val="20"/>
-          <w:u w:val="single"/>
-          <w:shd w:fill="auto" w:val="clear"/>
-          <w:vertAlign w:val="baseline"/>
-          <w:rtl w:val="0"/>
-        </w:rPr>
-        <w:t xml:space="preserve">{{NRCONTRACT}}</w:t>
-      </w:r>
-      <w:r>
-        <w:rPr>
-          <w:rFonts w:ascii="Arial" w:cs="Arial" w:eastAsia="Arial" w:hAnsi="Arial"/>
-          <w:b w:val="0"/>
-          <w:bCs w:val="0"/>
-          <w:i w:val="0"/>
-          <w:iCs w:val="0"/>
-          <w:smallCaps w:val="0"/>
-          <w:strike w:val="0"/>
-          <w:color w:val="000080"/>
-          <w:sz w:val="20"/>
-          <w:szCs w:val="20"/>
-          <w:u w:val="single"/>
-          <w:shd w:fill="auto" w:val="clear"/>
-          <w:vertAlign w:val="baseline"/>
-          <w:rtl w:val="0"/>
-        </w:rPr>
-        <w:t xml:space="preserve"> </w:t>
-      </w:r>
-      <w:r>
-        <w:rPr>
-          <w:rFonts w:ascii="Arial" w:cs="Arial" w:eastAsia="Arial" w:hAnsi="Arial"/>
-          <w:color w:val="000080"/>
-          <w:rtl w:val="0"/>
-        </w:rPr>
-        <w:t xml:space="preserve">......</w:t>
-      </w:r>
-      <w:r>
-        <w:rPr>
-          <w:rFonts w:ascii="Arial" w:cs="Arial" w:eastAsia="Arial" w:hAnsi="Arial"/>
-          <w:b w:val="0"/>
-          <w:bCs w:val="0"/>
-          <w:i w:val="0"/>
-          <w:iCs w:val="0"/>
-          <w:smallCaps w:val="0"/>
-          <w:strike w:val="0"/>
-          <w:color w:val="000080"/>
-          <w:sz w:val="20"/>
-          <w:szCs w:val="20"/>
-          <w:u w:val="none"/>
-          <w:shd w:fill="auto" w:val="clear"/>
-          <w:vertAlign w:val="baseline"/>
-          <w:rtl w:val="0"/>
-        </w:rPr>
-        <w:t xml:space="preserve"> din </w:t>
-      </w:r>
-      <w:r>
-        <w:rPr>
-          <w:rFonts w:ascii="Arial" w:cs="Arial" w:eastAsia="Arial" w:hAnsi="Arial"/>
-          <w:b w:val="1"/>
-          <w:bCs w:val="1"/>
-          <w:color w:val="000080"/>
-          <w:u w:val="single"/>
-          <w:rtl w:val="0"/>
-        </w:rPr>
-        <w:t xml:space="preserve">{{DATA}}</w:t>
-      </w:r>
-      <w:r>
-        <w:rPr>
-          <w:rFonts w:ascii="Arial" w:cs="Arial" w:eastAsia="Arial" w:hAnsi="Arial"/>
-          <w:b w:val="0"/>
-          <w:bCs w:val="0"/>
-          <w:i w:val="0"/>
-          <w:iCs w:val="0"/>
-          <w:smallCaps w:val="0"/>
-          <w:strike w:val="0"/>
-          <w:color w:val="000080"/>
-          <w:sz w:val="20"/>
-          <w:szCs w:val="20"/>
-          <w:u w:val="none"/>
-          <w:shd w:fill="auto" w:val="clear"/>
-          <w:vertAlign w:val="baseline"/>
-          <w:rtl w:val="0"/>
-        </w:rPr>
-        <w:t xml:space="preserve">.</w:t>
-      </w:r>
-      <w:r>
-        <w:rPr>
-          <w:rFonts w:ascii="Arial" w:cs="Arial" w:eastAsia="Arial" w:hAnsi="Arial"/>
-          <w:color w:val="000080"/>
-          <w:rtl w:val="0"/>
-        </w:rPr>
-        <w:t xml:space="preserve">..........</w:t>
-      </w:r>
-      <w:r>
-        <w:rPr>
-          <w:rFonts w:ascii="Arial" w:cs="Arial" w:eastAsia="Arial" w:hAnsi="Arial"/>
-          <w:b w:val="0"/>
-          <w:bCs w:val="0"/>
-          <w:i w:val="0"/>
-          <w:iCs w:val="0"/>
-          <w:smallCaps w:val="0"/>
-          <w:strike w:val="0"/>
-          <w:color w:val="000080"/>
-          <w:sz w:val="20"/>
-          <w:szCs w:val="20"/>
-          <w:u w:val="none"/>
-          <w:shd w:fill="auto" w:val="clear"/>
-          <w:vertAlign w:val="baseline"/>
-          <w:rtl w:val="0"/>
-        </w:rPr>
-        <w:t xml:space="preserve">, să exercite următoarele activităţi: </w:t>
-      </w:r>
-      <w:r>
-        <w:rPr>
-          <w:rFonts w:ascii="Arial" w:cs="Arial" w:eastAsia="Arial" w:hAnsi="Arial"/>
-          <w:b w:val="1"/>
-          <w:bCs w:val="1"/>
-          <w:i w:val="0"/>
-          <w:iCs w:val="0"/>
-          <w:smallCaps w:val="0"/>
-          <w:strike w:val="0"/>
-          <w:color w:val="000080"/>
-          <w:sz w:val="20"/>
-          <w:szCs w:val="20"/>
-          <w:u w:val="single"/>
-          <w:shd w:fill="auto" w:val="clear"/>
-          <w:vertAlign w:val="baseline"/>
-          <w:rtl w:val="0"/>
-        </w:rPr>
-        <w:t xml:space="preserve">{{ACTIVITATI_SC}}, stare status civil:</w:t>
-      </w:r>
-      <w:r>
-        <w:rPr>
-          <w:rFonts w:ascii="Arial" w:cs="Arial" w:eastAsia="Arial" w:hAnsi="Arial"/>
-          <w:b w:val="1"/>
-          <w:bCs w:val="1"/>
-          <w:color w:val="000080"/>
-          <w:u w:val="single"/>
-          <w:rtl w:val="0"/>
-        </w:rPr>
-        <w:t xml:space="preserve">{{FILIATIE}}</w:t>
-      </w:r>
-      <w:r>
-        <w:rPr>
-          <w:rFonts w:ascii="Arial" w:cs="Arial" w:eastAsia="Arial" w:hAnsi="Arial"/>
-          <w:b w:val="0"/>
-          <w:bCs w:val="0"/>
-          <w:i w:val="0"/>
-          <w:iCs w:val="0"/>
-          <w:smallCaps w:val="0"/>
-          <w:strike w:val="0"/>
-          <w:color w:val="000080"/>
-          <w:sz w:val="20"/>
-          <w:szCs w:val="20"/>
-          <w:u w:val="none"/>
-          <w:shd w:fill="auto" w:val="clear"/>
-          <w:vertAlign w:val="baseline"/>
-          <w:rtl w:val="0"/>
-        </w:rPr>
-        <w:t xml:space="preserve">………</w:t>
-      </w:r>
-      <w:r>
-        <w:rPr>
-          <w:rFonts w:ascii="Arial" w:cs="Arial" w:eastAsia="Arial" w:hAnsi="Arial"/>
-          <w:color w:val="000080"/>
-          <w:rtl w:val="0"/>
-        </w:rPr>
-        <w:t xml:space="preserve">…</w:t>
-      </w:r>
-      <w:r>
-        <w:rPr>
-          <w:rFonts w:ascii="Arial" w:cs="Arial" w:eastAsia="Arial" w:hAnsi="Arial"/>
-          <w:b w:val="0"/>
-          <w:bCs w:val="0"/>
-          <w:i w:val="0"/>
-          <w:iCs w:val="0"/>
-          <w:smallCaps w:val="0"/>
-          <w:strike w:val="0"/>
-          <w:color w:val="000080"/>
-          <w:sz w:val="20"/>
-          <w:szCs w:val="20"/>
-          <w:u w:val="none"/>
-          <w:shd w:fill="auto" w:val="clear"/>
-          <w:vertAlign w:val="baseline"/>
-          <w:rtl w:val="0"/>
-        </w:rPr>
-        <w:t xml:space="preserve">……………………...……….…</w:t>
-      </w:r>
-    </w:p>
-    <w:p>
-      <w:pPr>
-        <w:keepNext w:val="0"/>
-        <w:keepLines w:val="0"/>
-        <w:pageBreakBefore w:val="0"/>
-        <w:widowControl w:val="1"/>
-        <w:pBdr>
-          <w:top w:space="0" w:sz="0" w:val="nil"/>
-          <w:left w:space="0" w:sz="0" w:val="nil"/>
-          <w:bottom w:space="0" w:sz="0" w:val="nil"/>
-          <w:right w:space="0" w:sz="0" w:val="nil"/>
-          <w:between w:space="0" w:sz="0" w:val="nil"/>
-        </w:pBdr>
-        <w:shd w:fill="auto" w:val="clear"/>
-        <w:spacing w:after="0" w:before="0" w:line="240" w:lineRule="auto"/>
-        <w:ind w:left="0" w:right="0" w:firstLine="0"/>
-        <w:jc w:val="left"/>
-        <w:rPr>
-          <w:rFonts w:ascii="Arial" w:cs="Arial" w:eastAsia="Arial" w:hAnsi="Arial"/>
-          <w:b w:val="0"/>
-          <w:bCs w:val="0"/>
-          <w:i w:val="0"/>
-          <w:iCs w:val="0"/>
-          <w:smallCaps w:val="0"/>
-          <w:strike w:val="0"/>
-          <w:color w:val="000080"/>
-          <w:sz w:val="20"/>
-          <w:szCs w:val="20"/>
-          <w:u w:val="none"/>
-          <w:shd w:fill="auto" w:val="clear"/>
-          <w:vertAlign w:val="baseline"/>
-        </w:rPr>
-      </w:pPr>
-      <w:r>
-        <w:rPr>
-          <w:rFonts w:ascii="Arial" w:cs="Arial" w:eastAsia="Arial" w:hAnsi="Arial"/>
-          <w:b w:val="0"/>
-          <w:bCs w:val="0"/>
-          <w:i w:val="0"/>
-          <w:iCs w:val="0"/>
-          <w:smallCaps w:val="0"/>
-          <w:strike w:val="0"/>
-          <w:color w:val="000080"/>
-          <w:sz w:val="20"/>
-          <w:szCs w:val="20"/>
-          <w:u w:val="none"/>
-          <w:shd w:fill="auto" w:val="clear"/>
-          <w:vertAlign w:val="baseline"/>
-          <w:rtl w:val="0"/>
-        </w:rPr>
-        <w:t xml:space="preserve">…………………………..……………………………………………………………………………………………………………………………………………………………………………………………………………………………………………..……… </w:t>
-      </w:r>
-    </w:p>
-    <w:p>
-      <w:pPr>
-        <w:keepNext w:val="0"/>
-        <w:keepLines w:val="0"/>
-        <w:pageBreakBefore w:val="0"/>
-        <w:widowControl w:val="1"/>
-        <w:pBdr>
-          <w:top w:space="0" w:sz="0" w:val="nil"/>
-          <w:left w:space="0" w:sz="0" w:val="nil"/>
-          <w:bottom w:space="0" w:sz="0" w:val="nil"/>
-          <w:right w:space="0" w:sz="0" w:val="nil"/>
-          <w:between w:space="0" w:sz="0" w:val="nil"/>
-        </w:pBdr>
-        <w:shd w:fill="auto" w:val="clear"/>
-        <w:spacing w:after="0" w:before="0" w:line="240" w:lineRule="auto"/>
-        <w:ind w:left="0" w:right="0" w:firstLine="0"/>
-        <w:jc w:val="left"/>
-        <w:rPr>
-          <w:rFonts w:ascii="Arial" w:cs="Arial" w:eastAsia="Arial" w:hAnsi="Arial"/>
-          <w:b w:val="0"/>
-          <w:bCs w:val="0"/>
-          <w:i w:val="0"/>
-          <w:iCs w:val="0"/>
-          <w:smallCaps w:val="0"/>
-          <w:strike w:val="0"/>
-          <w:color w:val="000080"/>
-          <w:sz w:val="20"/>
-          <w:szCs w:val="20"/>
-          <w:u w:val="none"/>
-          <w:shd w:fill="auto" w:val="clear"/>
-          <w:vertAlign w:val="baseline"/>
-        </w:rPr>
-      </w:pPr>
-      <w:r>
-        <w:rPr>
-          <w:rFonts w:ascii="Arial" w:cs="Arial" w:eastAsia="Arial" w:hAnsi="Arial"/>
-          <w:b w:val="0"/>
-          <w:bCs w:val="0"/>
-          <w:i w:val="0"/>
-          <w:iCs w:val="0"/>
-          <w:smallCaps w:val="0"/>
-          <w:strike w:val="0"/>
-          <w:color w:val="000080"/>
-          <w:sz w:val="20"/>
-          <w:szCs w:val="20"/>
-          <w:u w:val="none"/>
-          <w:shd w:fill="auto" w:val="clear"/>
-          <w:vertAlign w:val="baseline"/>
-          <w:rtl w:val="0"/>
-        </w:rPr>
-        <w:t xml:space="preserve">şi să asiste/ să reprezinte clientul în faţa </w:t>
-      </w:r>
-      <w:r>
-        <w:rPr>
-          <w:rFonts w:ascii="Arial" w:cs="Arial" w:eastAsia="Arial" w:hAnsi="Arial"/>
-          <w:b w:val="1"/>
-          <w:bCs w:val="1"/>
-          <w:i w:val="0"/>
-          <w:iCs w:val="0"/>
-          <w:smallCaps w:val="0"/>
-          <w:strike w:val="0"/>
-          <w:color w:val="000080"/>
-          <w:sz w:val="20"/>
-          <w:szCs w:val="20"/>
-          <w:u w:val="single"/>
-          <w:shd w:fill="auto" w:val="clear"/>
-          <w:vertAlign w:val="baseline"/>
-          <w:rtl w:val="0"/>
-        </w:rPr>
-        <w:t xml:space="preserve">{{AUTORITATE_SC}}</w:t>
-      </w:r>
-      <w:r>
-        <w:rPr>
-          <w:rFonts w:ascii="Arial" w:cs="Arial" w:eastAsia="Arial" w:hAnsi="Arial"/>
-          <w:color w:val="000080"/>
-          <w:rtl w:val="0"/>
-        </w:rPr>
-        <w:t xml:space="preserve">.......</w:t>
-      </w:r>
-      <w:r>
-        <w:rPr>
-          <w:rFonts w:ascii="Arial" w:cs="Arial" w:eastAsia="Arial" w:hAnsi="Arial"/>
-          <w:b w:val="0"/>
-          <w:bCs w:val="0"/>
-          <w:i w:val="0"/>
-          <w:iCs w:val="0"/>
-          <w:smallCaps w:val="0"/>
-          <w:strike w:val="0"/>
-          <w:color w:val="000080"/>
-          <w:sz w:val="20"/>
-          <w:szCs w:val="20"/>
-          <w:u w:val="none"/>
-          <w:shd w:fill="auto" w:val="clear"/>
-          <w:vertAlign w:val="baseline"/>
-          <w:rtl w:val="0"/>
-        </w:rPr>
-        <w:t xml:space="preserve">…………………………………………….……..…… ……………………………………………………………………………………..............................................................................................................................................................…………………………………………................................................................................................................................................................……………………………………………...</w:t>
+        <w:t xml:space="preserve">……………………………………………………………………………………..............................................................................................................................................................…………………………………………................................................................................................................................................................……………………………………………...</w:t>
       </w:r>
     </w:p>
     <w:p>
@@ -1289,12 +1217,12 @@
                 <wp:extent cx="2752725" cy="2344562"/>
                 <wp:effectExtent b="0" l="0" r="0" t="0"/>
                 <wp:wrapNone/>
-                <wp:docPr id="1" name="image2.png"/>
+                <wp:docPr id="1" name="image1.png"/>
                 <a:graphic>
                   <a:graphicData uri="http://schemas.openxmlformats.org/drawingml/2006/picture">
                     <pic:pic>
                       <pic:nvPicPr>
-                        <pic:cNvPr id="0" name="image2.png"/>
+                        <pic:cNvPr id="0" name="image1.png"/>
                         <pic:cNvPicPr preferRelativeResize="0"/>
                       </pic:nvPicPr>
                       <pic:blipFill>

</xml_diff>

<commit_message>
feat(documents): imputernicire stare civila v5 (ajustari Raul)
Co-Authored-By: Claude Opus 4.8 (1M context) <noreply@anthropic.com>
</commit_message>
<xml_diff>
--- a/src/templates/certificat-casatorie/imputernicire.docx
+++ b/src/templates/certificat-casatorie/imputernicire.docx
@@ -69,12 +69,12 @@
             <wp:extent cx="600075" cy="607060"/>
             <wp:effectExtent b="0" l="0" r="0" t="0"/>
             <wp:wrapSquare wrapText="bothSides" distB="0" distT="0" distL="114300" distR="114300"/>
-            <wp:docPr descr="Sigla_UNBR_LUX" id="3" name="image2.jpg"/>
+            <wp:docPr descr="Sigla_UNBR_LUX" id="3" name="image1.jpg"/>
             <a:graphic>
               <a:graphicData uri="http://schemas.openxmlformats.org/drawingml/2006/picture">
                 <pic:pic>
                   <pic:nvPicPr>
-                    <pic:cNvPr descr="Sigla_UNBR_LUX" id="0" name="image2.jpg"/>
+                    <pic:cNvPr descr="Sigla_UNBR_LUX" id="0" name="image1.jpg"/>
                     <pic:cNvPicPr preferRelativeResize="0"/>
                   </pic:nvPicPr>
                   <pic:blipFill>
@@ -366,7 +366,7 @@
     </w:p>
     <w:p>
       <w:pPr>
-        <w:spacing w:line="276" w:lineRule="auto"/>
+        <w:spacing w:line="360" w:lineRule="auto"/>
         <w:rPr>
           <w:rFonts w:ascii="Arial" w:cs="Arial" w:eastAsia="Arial" w:hAnsi="Arial"/>
           <w:color w:val="000080"/>
@@ -434,7 +434,7 @@
           <w:rtl w:val="0"/>
         </w:rPr>
         <w:br w:type="textWrapping"/>
-        <w:t xml:space="preserve">....................</w:t>
+        <w:t xml:space="preserve">.........................................</w:t>
       </w:r>
       <w:r>
         <w:rPr>
@@ -454,7 +454,24 @@
           <w:vertAlign w:val="baseline"/>
           <w:rtl w:val="0"/>
         </w:rPr>
-        <w:t xml:space="preserve">............................…………………………, </w:t>
+        <w:t xml:space="preserve">............................…</w:t>
+      </w:r>
+      <w:r>
+        <w:rPr>
+          <w:rFonts w:ascii="Arial" w:cs="Arial" w:eastAsia="Arial" w:hAnsi="Arial"/>
+          <w:color w:val="000080"/>
+          <w:rtl w:val="0"/>
+        </w:rPr>
+        <w:t xml:space="preserve">………………..</w:t>
+      </w:r>
+      <w:r>
+        <w:rPr>
+          <w:rFonts w:ascii="Arial" w:cs="Arial" w:eastAsia="Arial" w:hAnsi="Arial"/>
+          <w:color w:val="000080"/>
+          <w:vertAlign w:val="baseline"/>
+          <w:rtl w:val="0"/>
+        </w:rPr>
+        <w:t xml:space="preserve">………………………, </w:t>
       </w:r>
     </w:p>
     <w:p>
@@ -471,7 +488,7 @@
           <w:between w:space="0" w:sz="0" w:val="nil"/>
         </w:pBdr>
         <w:shd w:fill="auto" w:val="clear"/>
-        <w:spacing w:after="0" w:before="0" w:line="276" w:lineRule="auto"/>
+        <w:spacing w:after="0" w:before="0" w:line="360" w:lineRule="auto"/>
         <w:ind w:left="0" w:right="0" w:firstLine="0"/>
         <w:jc w:val="left"/>
         <w:rPr>
@@ -605,7 +622,60 @@
           <w:vertAlign w:val="baseline"/>
           <w:rtl w:val="0"/>
         </w:rPr>
-        <w:t xml:space="preserve"> să exercite următoarele activităţi: </w:t>
+        <w:t xml:space="preserve"> să exercite următoarele </w:t>
+      </w:r>
+    </w:p>
+    <w:p>
+      <w:pPr>
+        <w:keepNext w:val="0"/>
+        <w:keepLines w:val="0"/>
+        <w:pageBreakBefore w:val="0"/>
+        <w:widowControl w:val="1"/>
+        <w:pBdr>
+          <w:top w:space="0" w:sz="0" w:val="nil"/>
+          <w:left w:space="0" w:sz="0" w:val="nil"/>
+          <w:bottom w:space="0" w:sz="0" w:val="nil"/>
+          <w:right w:space="0" w:sz="0" w:val="nil"/>
+          <w:between w:space="0" w:sz="0" w:val="nil"/>
+        </w:pBdr>
+        <w:shd w:fill="auto" w:val="clear"/>
+        <w:spacing w:after="0" w:before="0" w:line="360" w:lineRule="auto"/>
+        <w:ind w:left="0" w:right="0" w:firstLine="0"/>
+        <w:jc w:val="left"/>
+        <w:rPr>
+          <w:rFonts w:ascii="Arial" w:cs="Arial" w:eastAsia="Arial" w:hAnsi="Arial"/>
+          <w:b w:val="0"/>
+          <w:bCs w:val="0"/>
+          <w:i w:val="0"/>
+          <w:iCs w:val="0"/>
+          <w:smallCaps w:val="0"/>
+          <w:strike w:val="0"/>
+          <w:color w:val="000080"/>
+          <w:sz w:val="20"/>
+          <w:szCs w:val="20"/>
+          <w:u w:val="none"/>
+          <w:shd w:fill="auto" w:val="clear"/>
+          <w:vertAlign w:val="baseline"/>
+        </w:rPr>
+      </w:pPr>
+      <w:r>
+        <w:rPr>
+          <w:rFonts w:ascii="Arial" w:cs="Arial" w:eastAsia="Arial" w:hAnsi="Arial"/>
+          <w:b w:val="0"/>
+          <w:bCs w:val="0"/>
+          <w:i w:val="0"/>
+          <w:iCs w:val="0"/>
+          <w:smallCaps w:val="0"/>
+          <w:strike w:val="0"/>
+          <w:color w:val="000080"/>
+          <w:sz w:val="20"/>
+          <w:szCs w:val="20"/>
+          <w:u w:val="none"/>
+          <w:shd w:fill="auto" w:val="clear"/>
+          <w:vertAlign w:val="baseline"/>
+          <w:rtl w:val="0"/>
+        </w:rPr>
+        <w:t xml:space="preserve">activităţi: </w:t>
       </w:r>
       <w:r>
         <w:rPr>
@@ -1217,12 +1287,12 @@
                 <wp:extent cx="2752725" cy="2344562"/>
                 <wp:effectExtent b="0" l="0" r="0" t="0"/>
                 <wp:wrapNone/>
-                <wp:docPr id="1" name="image1.png"/>
+                <wp:docPr id="1" name="image2.png"/>
                 <a:graphic>
                   <a:graphicData uri="http://schemas.openxmlformats.org/drawingml/2006/picture">
                     <pic:pic>
                       <pic:nvPicPr>
-                        <pic:cNvPr id="0" name="image1.png"/>
+                        <pic:cNvPr id="0" name="image2.png"/>
                         <pic:cNvPicPr preferRelativeResize="0"/>
                       </pic:nvPicPr>
                       <pic:blipFill>

</xml_diff>

<commit_message>
feat(documents): imputernicire stare civila v6 FINAL (Raul)
Co-Authored-By: Claude Opus 4.8 (1M context) <noreply@anthropic.com>
</commit_message>
<xml_diff>
--- a/src/templates/certificat-casatorie/imputernicire.docx
+++ b/src/templates/certificat-casatorie/imputernicire.docx
@@ -430,11 +430,18 @@
         <w:rPr>
           <w:rFonts w:ascii="Arial" w:cs="Arial" w:eastAsia="Arial" w:hAnsi="Arial"/>
           <w:color w:val="000080"/>
+          <w:rtl w:val="0"/>
+        </w:rPr>
+        <w:t xml:space="preserve">................................................................,</w:t>
+      </w:r>
+      <w:r>
+        <w:rPr>
+          <w:rFonts w:ascii="Arial" w:cs="Arial" w:eastAsia="Arial" w:hAnsi="Arial"/>
+          <w:color w:val="000080"/>
           <w:vertAlign w:val="baseline"/>
           <w:rtl w:val="0"/>
         </w:rPr>
         <w:br w:type="textWrapping"/>
-        <w:t xml:space="preserve">.........................................</w:t>
       </w:r>
       <w:r>
         <w:rPr>
@@ -471,7 +478,24 @@
           <w:vertAlign w:val="baseline"/>
           <w:rtl w:val="0"/>
         </w:rPr>
-        <w:t xml:space="preserve">………………………, </w:t>
+        <w:t xml:space="preserve">……………</w:t>
+      </w:r>
+      <w:r>
+        <w:rPr>
+          <w:rFonts w:ascii="Arial" w:cs="Arial" w:eastAsia="Arial" w:hAnsi="Arial"/>
+          <w:color w:val="000080"/>
+          <w:rtl w:val="0"/>
+        </w:rPr>
+        <w:t xml:space="preserve">…………………</w:t>
+      </w:r>
+      <w:r>
+        <w:rPr>
+          <w:rFonts w:ascii="Arial" w:cs="Arial" w:eastAsia="Arial" w:hAnsi="Arial"/>
+          <w:color w:val="000080"/>
+          <w:vertAlign w:val="baseline"/>
+          <w:rtl w:val="0"/>
+        </w:rPr>
+        <w:t xml:space="preserve">…………, </w:t>
       </w:r>
     </w:p>
     <w:p>
@@ -578,6 +602,15 @@
       <w:r>
         <w:rPr>
           <w:rFonts w:ascii="Arial" w:cs="Arial" w:eastAsia="Arial" w:hAnsi="Arial"/>
+          <w:color w:val="000080"/>
+          <w:u w:val="single"/>
+          <w:rtl w:val="0"/>
+        </w:rPr>
+        <w:t xml:space="preserve"> </w:t>
+      </w:r>
+      <w:r>
+        <w:rPr>
+          <w:rFonts w:ascii="Arial" w:cs="Arial" w:eastAsia="Arial" w:hAnsi="Arial"/>
           <w:b w:val="0"/>
           <w:bCs w:val="0"/>
           <w:i w:val="0"/>
@@ -608,6 +641,14 @@
       <w:r>
         <w:rPr>
           <w:rFonts w:ascii="Arial" w:cs="Arial" w:eastAsia="Arial" w:hAnsi="Arial"/>
+          <w:color w:val="000080"/>
+          <w:rtl w:val="0"/>
+        </w:rPr>
+        <w:t xml:space="preserve">  </w:t>
+      </w:r>
+      <w:r>
+        <w:rPr>
+          <w:rFonts w:ascii="Arial" w:cs="Arial" w:eastAsia="Arial" w:hAnsi="Arial"/>
           <w:b w:val="0"/>
           <w:bCs w:val="0"/>
           <w:i w:val="0"/>
@@ -622,7 +663,7 @@
           <w:vertAlign w:val="baseline"/>
           <w:rtl w:val="0"/>
         </w:rPr>
-        <w:t xml:space="preserve"> să exercite următoarele </w:t>
+        <w:t xml:space="preserve">să exercite următoarele </w:t>
       </w:r>
     </w:p>
     <w:p>
@@ -709,8 +750,30 @@
       </w:r>
       <w:r>
         <w:rPr>
-          <w:rtl w:val="0"/>
-        </w:rPr>
+          <w:rFonts w:ascii="Arial" w:cs="Arial" w:eastAsia="Arial" w:hAnsi="Arial"/>
+          <w:color w:val="000080"/>
+          <w:rtl w:val="0"/>
+        </w:rPr>
+        <w:t xml:space="preserve"> ..</w:t>
+      </w:r>
+      <w:r>
+        <w:rPr>
+          <w:rFonts w:ascii="Arial" w:cs="Arial" w:eastAsia="Arial" w:hAnsi="Arial"/>
+          <w:b w:val="0"/>
+          <w:bCs w:val="0"/>
+          <w:i w:val="0"/>
+          <w:iCs w:val="0"/>
+          <w:smallCaps w:val="0"/>
+          <w:strike w:val="0"/>
+          <w:color w:val="000080"/>
+          <w:sz w:val="20"/>
+          <w:szCs w:val="20"/>
+          <w:u w:val="none"/>
+          <w:shd w:fill="auto" w:val="clear"/>
+          <w:vertAlign w:val="baseline"/>
+          <w:rtl w:val="0"/>
+        </w:rPr>
+        <w:t xml:space="preserve">……………………………………………….</w:t>
       </w:r>
     </w:p>
     <w:p>
@@ -727,7 +790,7 @@
           <w:between w:space="0" w:sz="0" w:val="nil"/>
         </w:pBdr>
         <w:shd w:fill="auto" w:val="clear"/>
-        <w:spacing w:after="0" w:before="0" w:line="276" w:lineRule="auto"/>
+        <w:spacing w:after="0" w:before="0" w:line="360" w:lineRule="auto"/>
         <w:ind w:left="0" w:right="0" w:firstLine="0"/>
         <w:jc w:val="left"/>
         <w:rPr>
@@ -763,7 +826,34 @@
           <w:vertAlign w:val="baseline"/>
           <w:rtl w:val="0"/>
         </w:rPr>
-        <w:t xml:space="preserve">…………………………..……………………………………………………………………………………………………………………………………………………………………………………………………………………………………………..……… </w:t>
+        <w:t xml:space="preserve">………………………………………………………………………………………………………………</w:t>
+      </w:r>
+      <w:r>
+        <w:rPr>
+          <w:rFonts w:ascii="Arial" w:cs="Arial" w:eastAsia="Arial" w:hAnsi="Arial"/>
+          <w:color w:val="000080"/>
+          <w:rtl w:val="0"/>
+        </w:rPr>
+        <w:t xml:space="preserve">…..</w:t>
+      </w:r>
+      <w:r>
+        <w:rPr>
+          <w:rFonts w:ascii="Arial" w:cs="Arial" w:eastAsia="Arial" w:hAnsi="Arial"/>
+          <w:b w:val="0"/>
+          <w:bCs w:val="0"/>
+          <w:i w:val="0"/>
+          <w:iCs w:val="0"/>
+          <w:smallCaps w:val="0"/>
+          <w:strike w:val="0"/>
+          <w:color w:val="000080"/>
+          <w:sz w:val="20"/>
+          <w:szCs w:val="20"/>
+          <w:u w:val="none"/>
+          <w:shd w:fill="auto" w:val="clear"/>
+          <w:vertAlign w:val="baseline"/>
+          <w:rtl w:val="0"/>
+        </w:rPr>
+        <w:t xml:space="preserve">……… </w:t>
       </w:r>
     </w:p>
     <w:p>

</xml_diff>

<commit_message>
feat(stare-civila): împuternicirea de căsătorie în formatul modelului de mână + localitatea căsătoriei colectată
- ACTIVITATI_SC: „Să obțină Extrasul Multilingv de Căsătorie … în
  Localitatea: Oradea, Județul: Bihor." (Title Case, etichete de loc,
  punct final); „Stare Status Civil: Căsătorit" pe rând nou, capitalizat
  (cele 2 template-uri .docx de căsătorie modificate cu <w:br/>;
  naștere/celibat neatinse)
- câmp nou obligatoriu „Localitatea în care a avut loc căsătoria"
  (marriageLocality) în pasul de stare civilă, doar la documentType
  'casatorie' — fără migrare; intră în împuternicire, cererile ANEXA 4/59
  (buildLocCasatorie preferă localitatea) și cardul admin; comenzile vechi
  cad pe județ în ambele etichete
- mobil: buton X vizibil pe panoul „Rezumat comandă" din bara sticky —
  client blocat cu panoul deschis (30.07), backdrop/chevron ne-evidente

Teste: generator 71/71, tsc --noEmit curat.

Co-Authored-By: Claude Fable 5 <noreply@anthropic.com>
</commit_message>
<xml_diff>
--- a/src/templates/certificat-casatorie/imputernicire.docx
+++ b/src/templates/certificat-casatorie/imputernicire.docx
@@ -735,7 +735,9 @@
           <w:vertAlign w:val="baseline"/>
           <w:rtl w:val="0"/>
         </w:rPr>
-        <w:t xml:space="preserve">{{ACTIVITATI_SC}}, stare status civil:</w:t>
+        <w:t xml:space="preserve">{{ACTIVITATI_SC}}</w:t>
+        <w:br/>
+        <w:t xml:space="preserve">Stare Status Civil: </w:t>
       </w:r>
       <w:r>
         <w:rPr>

</xml_diff>